<commit_message>
docs(lot6): pollution et biodiversité grise, ponts ouverts depuis les cinq indicateurs du RSEE ; décision D3 du dossier mise à jour
</commit_message>
<xml_diff>
--- a/livraison/OpenNAT, dossier de soumission au Biodiversity Standard Council.docx
+++ b/livraison/OpenNAT, dossier de soumission au Biodiversity Standard Council.docx
@@ -24,7 +24,7 @@
           <w:rFonts w:ascii="Calibri" w:hAnsi="Calibri"/>
           <w:sz w:val="20"/>
         </w:rPr>
-        <w:t>NORMATYS, éditeur de la méthode. Méthode OpenNAT 1 (révision du 19 octobre 2026), données 1.2.2, moteur 0.2.0. Projet de dossier du 19 octobre 2026, non transmis.</w:t>
+        <w:t>NORMATYS, éditeur de la méthode. Méthode OpenNAT 1 (révision du 19 octobre 2026), données 1.2.2, moteur 0.2.0. Projet de dossier du 19 octobre 2026, non transmis. Complété par la note « Pollution et biodiversité grise : ponts depuis les indicateurs du RSEE ».</w:t>
       </w:r>
     </w:p>
     <w:p>
@@ -781,7 +781,7 @@
                 <w:rFonts w:ascii="Calibri" w:hAnsi="Calibri"/>
                 <w:sz w:val="20"/>
               </w:rPr>
-              <w:t>intégrer l'eutrophisation terrestre par GLOBIO, publier les eutrophisations en espèce·an, ouvrir le chantier de l'écotoxicité</w:t>
+              <w:t>convertir les cinq indicateurs du RSEE par des facteurs ouverts et les ajouter à Inat (option P5, note dédiée)</w:t>
             </w:r>
           </w:p>
         </w:tc>
@@ -2263,7 +2263,6 @@
     </w:p>
     <w:p>
       <w:pPr>
-        <w:keepNext/>
         <w:spacing w:before="57" w:after="227" w:line="288" w:lineRule="auto"/>
       </w:pPr>
       <w:r>
@@ -2271,296 +2270,7 @@
           <w:rFonts w:ascii="Calibri" w:hAnsi="Calibri"/>
           <w:sz w:val="20"/>
         </w:rPr>
-        <w:t>Sur neuf bâtiments de RSEE réels du groupe, les médianes par m² de surface de référence (phases A à C) sont : 805 kg CO2 éq., 0,21 mol H+ éq., 0,0081 kg P éq., 0,037 kg N éq., 0,38 mol N éq., 2,4 CTUe. Trois voies sourcées ont été chiffrées sur ce bâtiment médian :</w:t>
-      </w:r>
-    </w:p>
-    <w:tbl>
-      <w:tblPr>
-        <w:tblStyle w:val="TableGrid"/>
-        <w:tblW w:type="auto" w:w="0"/>
-        <w:jc w:val="center"/>
-        <w:tblLook w:firstColumn="1" w:firstRow="1" w:lastColumn="0" w:lastRow="0" w:noHBand="0" w:noVBand="1" w:val="04A0"/>
-        <w:tblBorders>
-          <w:top w:val="single" w:sz="4" w:space="0" w:color="C9D6DE"/>
-          <w:left w:val="single" w:sz="4" w:space="0" w:color="C9D6DE"/>
-          <w:bottom w:val="single" w:sz="4" w:space="0" w:color="C9D6DE"/>
-          <w:right w:val="single" w:sz="4" w:space="0" w:color="C9D6DE"/>
-          <w:insideH w:val="single" w:sz="4" w:space="0" w:color="C9D6DE"/>
-          <w:insideV w:val="single" w:sz="4" w:space="0" w:color="C9D6DE"/>
-        </w:tblBorders>
-        <w:tblLayout w:type="fixed"/>
-      </w:tblPr>
-      <w:tblGrid>
-        <w:gridCol w:w="2999"/>
-        <w:gridCol w:w="3319"/>
-        <w:gridCol w:w="3319"/>
-      </w:tblGrid>
-      <w:tr>
-        <w:trPr>
-          <w:tblHeader/>
-          <w:cantSplit/>
-        </w:trPr>
-        <w:tc>
-          <w:tcPr>
-            <w:tcW w:type="dxa" w:w="2999"/>
-            <w:vAlign w:val="center"/>
-            <w:shd w:val="clear" w:color="auto" w:fill="202335"/>
-          </w:tcPr>
-          <w:p>
-            <w:pPr>
-              <w:keepNext/>
-              <w:spacing w:before="79" w:after="79" w:line="276" w:lineRule="auto"/>
-            </w:pPr>
-            <w:r>
-              <w:rPr>
-                <w:rFonts w:ascii="Calibri" w:hAnsi="Calibri"/>
-                <w:b/>
-                <w:color w:val="FFFFFF"/>
-                <w:sz w:val="20"/>
-              </w:rPr>
-              <w:t>Voie</w:t>
-            </w:r>
-          </w:p>
-        </w:tc>
-        <w:tc>
-          <w:tcPr>
-            <w:tcW w:type="dxa" w:w="3319"/>
-            <w:vAlign w:val="center"/>
-            <w:shd w:val="clear" w:color="auto" w:fill="202335"/>
-          </w:tcPr>
-          <w:p>
-            <w:pPr>
-              <w:keepNext/>
-              <w:spacing w:before="79" w:after="79" w:line="276" w:lineRule="auto"/>
-            </w:pPr>
-            <w:r>
-              <w:rPr>
-                <w:rFonts w:ascii="Calibri" w:hAnsi="Calibri"/>
-                <w:b/>
-                <w:color w:val="FFFFFF"/>
-                <w:sz w:val="20"/>
-              </w:rPr>
-              <w:t>Source</w:t>
-            </w:r>
-          </w:p>
-        </w:tc>
-        <w:tc>
-          <w:tcPr>
-            <w:tcW w:type="dxa" w:w="3319"/>
-            <w:vAlign w:val="center"/>
-            <w:shd w:val="clear" w:color="auto" w:fill="202335"/>
-          </w:tcPr>
-          <w:p>
-            <w:pPr>
-              <w:keepNext/>
-              <w:spacing w:before="79" w:after="79" w:line="276" w:lineRule="auto"/>
-            </w:pPr>
-            <w:r>
-              <w:rPr>
-                <w:rFonts w:ascii="Calibri" w:hAnsi="Calibri"/>
-                <w:b/>
-                <w:color w:val="FFFFFF"/>
-                <w:sz w:val="20"/>
-              </w:rPr>
-              <w:t>Poids face au climat</w:t>
-            </w:r>
-          </w:p>
-        </w:tc>
-      </w:tr>
-      <w:tr>
-        <w:trPr>
-          <w:cantSplit/>
-        </w:trPr>
-        <w:tc>
-          <w:tcPr>
-            <w:tcW w:type="dxa" w:w="2999"/>
-            <w:vAlign w:val="center"/>
-          </w:tcPr>
-          <w:p>
-            <w:pPr>
-              <w:keepNext/>
-              <w:spacing w:before="79" w:after="79" w:line="276" w:lineRule="auto"/>
-            </w:pPr>
-            <w:r>
-              <w:rPr>
-                <w:rFonts w:ascii="Calibri" w:hAnsi="Calibri"/>
-                <w:sz w:val="20"/>
-              </w:rPr>
-              <w:t>P2, eutrophisation terrestre dans Inat</w:t>
-            </w:r>
-          </w:p>
-        </w:tc>
-        <w:tc>
-          <w:tcPr>
-            <w:tcW w:type="dxa" w:w="3319"/>
-            <w:vAlign w:val="center"/>
-          </w:tcPr>
-          <w:p>
-            <w:pPr>
-              <w:keepNext/>
-              <w:spacing w:before="79" w:after="79" w:line="276" w:lineRule="auto"/>
-            </w:pPr>
-            <w:r>
-              <w:rPr>
-                <w:rFonts w:ascii="Calibri" w:hAnsi="Calibri"/>
-                <w:sz w:val="20"/>
-              </w:rPr>
-              <w:t>GLOBIO 3.5, tableau 4.1 : MSA = 1 - 0,220 ln(NE + 1) pour les forêts, NE étant l'azote déposé au-delà de la charge critique (g/m²/an) ; l'indicateur 109 mesure ce même excès, d'où 3,1 m²HE·an par mol N éq.</w:t>
-            </w:r>
-          </w:p>
-        </w:tc>
-        <w:tc>
-          <w:tcPr>
-            <w:tcW w:type="dxa" w:w="3319"/>
-            <w:vAlign w:val="center"/>
-          </w:tcPr>
-          <w:p>
-            <w:pPr>
-              <w:keepNext/>
-              <w:spacing w:before="79" w:after="79" w:line="276" w:lineRule="auto"/>
-            </w:pPr>
-            <w:r>
-              <w:rPr>
-                <w:rFonts w:ascii="Calibri" w:hAnsi="Calibri"/>
-                <w:sz w:val="20"/>
-              </w:rPr>
-              <w:t>0,6 à 1,2 m²HE·an par m², soit 0,8 à 1,6 % du climat</w:t>
-            </w:r>
-          </w:p>
-        </w:tc>
-      </w:tr>
-      <w:tr>
-        <w:trPr>
-          <w:cantSplit/>
-        </w:trPr>
-        <w:tc>
-          <w:tcPr>
-            <w:tcW w:type="dxa" w:w="2999"/>
-            <w:vAlign w:val="center"/>
-          </w:tcPr>
-          <w:p>
-            <w:pPr>
-              <w:keepNext/>
-              <w:spacing w:before="79" w:after="79" w:line="276" w:lineRule="auto"/>
-            </w:pPr>
-            <w:r>
-              <w:rPr>
-                <w:rFonts w:ascii="Calibri" w:hAnsi="Calibri"/>
-                <w:sz w:val="20"/>
-              </w:rPr>
-              <w:t>P3, eutrophisations en espèce·an, à part</w:t>
-            </w:r>
-          </w:p>
-        </w:tc>
-        <w:tc>
-          <w:tcPr>
-            <w:tcW w:type="dxa" w:w="3319"/>
-            <w:vAlign w:val="center"/>
-          </w:tcPr>
-          <w:p>
-            <w:pPr>
-              <w:keepNext/>
-              <w:spacing w:before="79" w:after="79" w:line="276" w:lineRule="auto"/>
-            </w:pPr>
-            <w:r>
-              <w:rPr>
-                <w:rFonts w:ascii="Calibri" w:hAnsi="Calibri"/>
-                <w:sz w:val="20"/>
-              </w:rPr>
-              <w:t>ReCiPe 2016, facteurs de passage à l'effet : 6,7 × 10⁻⁷ par kg P éq., 1,7 × 10⁻⁹ par kg N éq. (mêmes unités que 107 et 108)</w:t>
-            </w:r>
-          </w:p>
-        </w:tc>
-        <w:tc>
-          <w:tcPr>
-            <w:tcW w:type="dxa" w:w="3319"/>
-            <w:vAlign w:val="center"/>
-          </w:tcPr>
-          <w:p>
-            <w:pPr>
-              <w:keepNext/>
-              <w:spacing w:before="79" w:after="79" w:line="276" w:lineRule="auto"/>
-            </w:pPr>
-            <w:r>
-              <w:rPr>
-                <w:rFonts w:ascii="Calibri" w:hAnsi="Calibri"/>
-                <w:sz w:val="20"/>
-              </w:rPr>
-              <w:t>0,24 % du climat en espèce·an</w:t>
-            </w:r>
-          </w:p>
-        </w:tc>
-      </w:tr>
-      <w:tr>
-        <w:trPr>
-          <w:cantSplit/>
-        </w:trPr>
-        <w:tc>
-          <w:tcPr>
-            <w:tcW w:type="dxa" w:w="2999"/>
-            <w:vAlign w:val="center"/>
-          </w:tcPr>
-          <w:p>
-            <w:pPr>
-              <w:spacing w:before="79" w:after="79" w:line="276" w:lineRule="auto"/>
-            </w:pPr>
-            <w:r>
-              <w:rPr>
-                <w:rFonts w:ascii="Calibri" w:hAnsi="Calibri"/>
-                <w:sz w:val="20"/>
-              </w:rPr>
-              <w:t>P4, forfait calé sur Carbone 4</w:t>
-            </w:r>
-          </w:p>
-        </w:tc>
-        <w:tc>
-          <w:tcPr>
-            <w:tcW w:type="dxa" w:w="3319"/>
-            <w:vAlign w:val="center"/>
-          </w:tcPr>
-          <w:p>
-            <w:pPr>
-              <w:spacing w:before="79" w:after="79" w:line="276" w:lineRule="auto"/>
-            </w:pPr>
-            <w:r>
-              <w:rPr>
-                <w:rFonts w:ascii="Calibri" w:hAnsi="Calibri"/>
-                <w:sz w:val="20"/>
-              </w:rPr>
-              <w:t>rapport pollution sur climat de leur bâtiment béton (51 / 38)</w:t>
-            </w:r>
-          </w:p>
-        </w:tc>
-        <w:tc>
-          <w:tcPr>
-            <w:tcW w:type="dxa" w:w="3319"/>
-            <w:vAlign w:val="center"/>
-          </w:tcPr>
-          <w:p>
-            <w:pPr>
-              <w:spacing w:before="79" w:after="79" w:line="276" w:lineRule="auto"/>
-            </w:pPr>
-            <w:r>
-              <w:rPr>
-                <w:rFonts w:ascii="Calibri" w:hAnsi="Calibri"/>
-                <w:sz w:val="20"/>
-              </w:rPr>
-              <w:t>ajoute 1,34 fois le climat</w:t>
-            </w:r>
-          </w:p>
-        </w:tc>
-      </w:tr>
-    </w:tbl>
-    <w:p>
-      <w:pPr>
-        <w:spacing w:before="57" w:after="227" w:line="288" w:lineRule="auto"/>
-      </w:pPr>
-      <w:r>
-        <w:rPr>
-          <w:rFonts w:ascii="Calibri" w:hAnsi="Calibri"/>
-          <w:sz w:val="20"/>
-        </w:rPr>
-        <w:t>Le constat est net : les facteurs ouverts lus ne retrouvent pas la part de Carbone 4. Celle-ci tient à l'écotoxicité et à l'acidification, pour lesquelles aucun facteur ouvert ne part des unités du RSEE (CTUe, mol H+ éq.). Le forfait P4 reposerait sur une seule étude, sans licence, et rendrait la pollution proportionnelle au carbone : il est écarté.</w:t>
+        <w:t>Une note dédiée, « Pollution et biodiversité grise : ponts depuis les indicateurs du RSEE », cherche pour chacun des cinq indicateurs un facteur publié et ouvert : IMPACT World+ pour l'écotoxicité et l'eutrophisation marine, ReCiPe 2016 pour l'acidification et l'eutrophisation des eaux douces, GLOBIO 3.5 pour l'eutrophisation terrestre. Sur neuf bâtiments de RSEE réels du groupe, la pollution ainsi convertie pèse de 4 à 13 % du climat, et l'écotoxicité déclarée reste négligeable même au plus haut.</w:t>
       </w:r>
     </w:p>
     <w:p>
@@ -2572,7 +2282,19 @@
           <w:rFonts w:ascii="Calibri" w:hAnsi="Calibri"/>
           <w:sz w:val="20"/>
         </w:rPr>
-        <w:t>Recommandation : intégrer P2 dans Inat (pont sourcé, faible poids, même unité) ; publier P3 en indicateur complémentaire ; ouvrir le chantier de l'écotoxicité, en partant de la conversion des unités toxiques comparatives (CTUe) en fraction d'espèces que pratique IMPACT World+ ; ne fixer aucun seuil d'Inat ni de Snat avant ce travail.</w:t>
+        <w:t>Les 51 % de Carbone 4 viennent d'un autre modèle : inventaires ecoinvent mis à l'échelle du carbone de chaque fiche et facteurs à long terme d'IMPACT World+ pour les métaux. Ce modèle ne se reconstruit pas à partir des données d'une étude RE2020, ecoinvent n'étant pas ouvert et la licence du service INIES interdisant la notation des fiches. Un forfait calé sur Carbone 4 (pollution égale à 1,34 fois le climat) reposerait sur une seule étude, sans licence, et rendrait la pollution proportionnelle au carbone : il est écarté.</w:t>
+      </w:r>
+    </w:p>
+    <w:p>
+      <w:pPr>
+        <w:spacing w:before="57" w:after="227" w:line="288" w:lineRule="auto"/>
+      </w:pPr>
+      <w:r>
+        <w:rPr>
+          <w:rFonts w:ascii="Calibri" w:hAnsi="Calibri"/>
+          <w:sz w:val="20"/>
+        </w:rPr>
+        <w:t>Recommandation : option P5 de la note, c'est-à-dire convertir les cinq indicateurs par ces ponts, chacun avec sa plage d'incertitude, et les ajouter à Inat ; dire en clair que l'écotoxicité à long terme des métaux n'est pas comptée ; vérifier avant adoption les facteurs EF de l'acidification. La note donne la transposition prête à appliquer (convention, cinq lignes de table, une équation).</w:t>
       </w:r>
     </w:p>
     <w:p>
@@ -2636,7 +2358,7 @@
           <w:rFonts w:ascii="Calibri" w:hAnsi="Calibri"/>
           <w:sz w:val="20"/>
         </w:rPr>
-        <w:t>Bnat minimal selon la typologie et la part d'emprise (45, 35 ou 25 points en logement ; 25 en tertiaire ; pas de seuil en industrie et aménagement), raccordé au coefficient de biotope du référentiel Effinature 8.1 ; pleine terre d'au moins 15 % de l'emprise totale du projet ; niveau 1 du site pour Cnat nul ou négatif, niveau 2 pour un gain d'au moins 10 % de la valeur initiale intégrée. Inat et Snat n'ont pas de seuil : ils seront fixés sur la distribution d'opérations réelles, comme ceux de l'Ic construction, et après D3.</w:t>
+        <w:t>Bnat minimal selon la typologie et la part d'emprise (45, 35 ou 25 points en logement ; 25 en tertiaire ; pas de seuil en industrie et aménagement), raccordé au coefficient de biotope du référentiel Effinature 8.1 ; pleine terre d'au moins 15 % de l'emprise totale du projet ; niveau 1 du site pour Cnat nul ou négatif, niveau 2 pour un gain d'au moins 10 % de la valeur initiale intégrée. Inat et Snat n'ont pas de seuil : ils seront fixés sur la distribution d'opérations réelles, comme ceux de l'Ic construction, une fois D3 tranchée.</w:t>
       </w:r>
     </w:p>
     <w:p>
@@ -3006,7 +2728,7 @@
                 <w:rFonts w:ascii="Calibri" w:hAnsi="Calibri"/>
                 <w:sz w:val="20"/>
               </w:rPr>
-              <w:t>lecture des sources du rendement alloué ; relecture écologue des fiches habitats ; travail sur l'écotoxicité</w:t>
+              <w:t>lecture des sources du rendement alloué ; relecture écologue des fiches habitats ; vérification des facteurs EF de l'acidification</w:t>
             </w:r>
           </w:p>
         </w:tc>
@@ -8714,6 +8436,7 @@
       <w:pPr>
         <w:pStyle w:val="Heading1"/>
         <w:keepNext/>
+        <w:pageBreakBefore/>
         <w:spacing w:before="397" w:after="170"/>
       </w:pPr>
       <w:r>
@@ -9341,6 +9064,124 @@
                 <w:sz w:val="20"/>
               </w:rPr>
               <w:t>lu en entier par l'audit</w:t>
+            </w:r>
+          </w:p>
+        </w:tc>
+      </w:tr>
+      <w:tr>
+        <w:trPr>
+          <w:cantSplit/>
+        </w:trPr>
+        <w:tc>
+          <w:tcPr>
+            <w:tcW w:type="dxa" w:w="3213"/>
+            <w:vAlign w:val="center"/>
+          </w:tcPr>
+          <w:p>
+            <w:pPr>
+              <w:spacing w:before="79" w:after="79" w:line="276" w:lineRule="auto"/>
+            </w:pPr>
+            <w:r>
+              <w:rPr>
+                <w:rFonts w:ascii="Calibri" w:hAnsi="Calibri"/>
+                <w:sz w:val="20"/>
+              </w:rPr>
+              <w:t>Bulle et al. 2019, IMPACT World+, Int J LCA 24, 1653-1674, article et supplément (CC BY 4.0)</w:t>
+            </w:r>
+          </w:p>
+        </w:tc>
+        <w:tc>
+          <w:tcPr>
+            <w:tcW w:type="dxa" w:w="3213"/>
+            <w:vAlign w:val="center"/>
+          </w:tcPr>
+          <w:p>
+            <w:pPr>
+              <w:spacing w:before="79" w:after="79" w:line="276" w:lineRule="auto"/>
+            </w:pPr>
+            <w:r>
+              <w:rPr>
+                <w:rFonts w:ascii="Calibri" w:hAnsi="Calibri"/>
+                <w:sz w:val="20"/>
+              </w:rPr>
+              <w:t>conversion de l'écotoxicité et eutrophisation marine</w:t>
+            </w:r>
+          </w:p>
+        </w:tc>
+        <w:tc>
+          <w:tcPr>
+            <w:tcW w:type="dxa" w:w="3213"/>
+            <w:vAlign w:val="center"/>
+          </w:tcPr>
+          <w:p>
+            <w:pPr>
+              <w:spacing w:before="79" w:after="79" w:line="276" w:lineRule="auto"/>
+            </w:pPr>
+            <w:r>
+              <w:rPr>
+                <w:rFonts w:ascii="Calibri" w:hAnsi="Calibri"/>
+                <w:sz w:val="20"/>
+              </w:rPr>
+              <w:t>lu</w:t>
+            </w:r>
+          </w:p>
+        </w:tc>
+      </w:tr>
+      <w:tr>
+        <w:trPr>
+          <w:cantSplit/>
+        </w:trPr>
+        <w:tc>
+          <w:tcPr>
+            <w:tcW w:type="dxa" w:w="3213"/>
+            <w:vAlign w:val="center"/>
+          </w:tcPr>
+          <w:p>
+            <w:pPr>
+              <w:spacing w:before="79" w:after="79" w:line="276" w:lineRule="auto"/>
+            </w:pPr>
+            <w:r>
+              <w:rPr>
+                <w:rFonts w:ascii="Calibri" w:hAnsi="Calibri"/>
+                <w:sz w:val="20"/>
+              </w:rPr>
+              <w:t>ReCiPe 2016, rapport RIVM 2017-0028</w:t>
+            </w:r>
+          </w:p>
+        </w:tc>
+        <w:tc>
+          <w:tcPr>
+            <w:tcW w:type="dxa" w:w="3213"/>
+            <w:vAlign w:val="center"/>
+          </w:tcPr>
+          <w:p>
+            <w:pPr>
+              <w:spacing w:before="79" w:after="79" w:line="276" w:lineRule="auto"/>
+            </w:pPr>
+            <w:r>
+              <w:rPr>
+                <w:rFonts w:ascii="Calibri" w:hAnsi="Calibri"/>
+                <w:sz w:val="20"/>
+              </w:rPr>
+              <w:t>densités d'espèces terrestres et d'eau douce</w:t>
+            </w:r>
+          </w:p>
+        </w:tc>
+        <w:tc>
+          <w:tcPr>
+            <w:tcW w:type="dxa" w:w="3213"/>
+            <w:vAlign w:val="center"/>
+          </w:tcPr>
+          <w:p>
+            <w:pPr>
+              <w:spacing w:before="79" w:after="79" w:line="276" w:lineRule="auto"/>
+            </w:pPr>
+            <w:r>
+              <w:rPr>
+                <w:rFonts w:ascii="Calibri" w:hAnsi="Calibri"/>
+                <w:sz w:val="20"/>
+              </w:rPr>
+              <w:t>lu</w:t>
             </w:r>
           </w:p>
         </w:tc>

</xml_diff>

<commit_message>
feat(lot7): graphique de trajectoire, guide au papier IRICE hors portée, facteurs EF relus, option de fin de gestion progressive, note sur les droits et licences NORMATYS-IRICE
</commit_message>
<xml_diff>
--- a/livraison/OpenNAT, dossier de soumission au Biodiversity Standard Council.docx
+++ b/livraison/OpenNAT, dossier de soumission au Biodiversity Standard Council.docx
@@ -1105,7 +1105,7 @@
                 <w:rFonts w:ascii="Calibri" w:hAnsi="Calibri"/>
                 <w:sz w:val="20"/>
               </w:rPr>
-              <w:t>confirmer</w:t>
+              <w:t>confirmer ; fin de plan étalée sur deux ans</w:t>
             </w:r>
           </w:p>
         </w:tc>
@@ -2294,7 +2294,7 @@
           <w:rFonts w:ascii="Calibri" w:hAnsi="Calibri"/>
           <w:sz w:val="20"/>
         </w:rPr>
-        <w:t>Recommandation : option P5 de la note, c'est-à-dire convertir les cinq indicateurs par ces ponts, chacun avec sa plage d'incertitude, et les ajouter à Inat ; dire en clair que l'écotoxicité à long terme des métaux n'est pas comptée ; vérifier avant adoption les facteurs EF de l'acidification. La note donne la transposition prête à appliquer (convention, cinq lignes de table, une équation).</w:t>
+        <w:t>Recommandation : option P5 de la note, c'est-à-dire convertir les cinq indicateurs par ces ponts, chacun avec sa plage d'incertitude, et les ajouter à Inat ; dire en clair que l'écotoxicité à long terme des métaux n'est pas comptée. La note donne la transposition prête à appliquer (convention, cinq lignes de table, une équation).</w:t>
       </w:r>
     </w:p>
     <w:p>
@@ -2446,7 +2446,33 @@
           <w:rFonts w:ascii="Calibri" w:hAnsi="Calibri"/>
           <w:sz w:val="20"/>
         </w:rPr>
-        <w:t>Recommandation : confirmer ; c'est la décision qui a le plus d'effet sur les projets, et elle récompense un engagement vérifiable à l'achèvement.</w:t>
+        <w:t>Une option affine C-M3 : à la fin du plan, la perte de valeur se fait aujourd'hui en une année, ce qui dessine une marche sur la trajectoire du site. Étalée sur deux ans, durée que C-M2 retient déjà pour un milieu herbacé abandonné, elle ramène Cnat de 3 217 à 3 171 m²HE·an sur l'exemple de l'annexe C ; sur trois ans, à 3 147. Sur les 65 cas du banc concernés, la baisse médiane est de 61 m²HE·an sur deux ans (</w:t>
+      </w:r>
+      <w:r>
+        <w:rPr>
+          <w:rFonts w:ascii="Calibri" w:hAnsi="Calibri"/>
+          <w:sz w:val="20"/>
+        </w:rPr>
+        <w:t>python -m banc.options_gestion</w:t>
+      </w:r>
+      <w:r>
+        <w:rPr>
+          <w:rFonts w:ascii="Calibri" w:hAnsi="Calibri"/>
+          <w:sz w:val="20"/>
+        </w:rPr>
+        <w:t>).</w:t>
+      </w:r>
+    </w:p>
+    <w:p>
+      <w:pPr>
+        <w:spacing w:before="57" w:after="227" w:line="288" w:lineRule="auto"/>
+      </w:pPr>
+      <w:r>
+        <w:rPr>
+          <w:rFonts w:ascii="Calibri" w:hAnsi="Calibri"/>
+          <w:sz w:val="20"/>
+        </w:rPr>
+        <w:t>Recommandation : confirmer C-M1 et C-M2, et adopter pour C-M3 une fin de plan étalée sur deux ans ; c'est la décision qui a le plus d'effet sur les projets, et elle récompense un engagement vérifiable à l'achèvement.</w:t>
       </w:r>
     </w:p>
     <w:p>
@@ -2728,7 +2754,7 @@
                 <w:rFonts w:ascii="Calibri" w:hAnsi="Calibri"/>
                 <w:sz w:val="20"/>
               </w:rPr>
-              <w:t>lecture des sources du rendement alloué ; relecture écologue des fiches habitats ; vérification des facteurs EF de l'acidification</w:t>
+              <w:t>lecture des sources du rendement alloué ; relecture écologue des fiches habitats</w:t>
             </w:r>
           </w:p>
         </w:tc>
@@ -8436,7 +8462,6 @@
       <w:pPr>
         <w:pStyle w:val="Heading1"/>
         <w:keepNext/>
-        <w:pageBreakBefore/>
         <w:spacing w:before="397" w:after="170"/>
       </w:pPr>
       <w:r>
@@ -9164,6 +9189,65 @@
                 <w:sz w:val="20"/>
               </w:rPr>
               <w:t>densités d'espèces terrestres et d'eau douce</w:t>
+            </w:r>
+          </w:p>
+        </w:tc>
+        <w:tc>
+          <w:tcPr>
+            <w:tcW w:type="dxa" w:w="3213"/>
+            <w:vAlign w:val="center"/>
+          </w:tcPr>
+          <w:p>
+            <w:pPr>
+              <w:spacing w:before="79" w:after="79" w:line="276" w:lineRule="auto"/>
+            </w:pPr>
+            <w:r>
+              <w:rPr>
+                <w:rFonts w:ascii="Calibri" w:hAnsi="Calibri"/>
+                <w:sz w:val="20"/>
+              </w:rPr>
+              <w:t>lu</w:t>
+            </w:r>
+          </w:p>
+        </w:tc>
+      </w:tr>
+      <w:tr>
+        <w:trPr>
+          <w:cantSplit/>
+        </w:trPr>
+        <w:tc>
+          <w:tcPr>
+            <w:tcW w:type="dxa" w:w="3213"/>
+            <w:vAlign w:val="center"/>
+          </w:tcPr>
+          <w:p>
+            <w:pPr>
+              <w:spacing w:before="79" w:after="79" w:line="276" w:lineRule="auto"/>
+            </w:pPr>
+            <w:r>
+              <w:rPr>
+                <w:rFonts w:ascii="Calibri" w:hAnsi="Calibri"/>
+                <w:sz w:val="20"/>
+              </w:rPr>
+              <w:t>ÖKOBAU.DAT, méthode EF d'acidification par dépassement cumulé, version 01.03.010</w:t>
+            </w:r>
+          </w:p>
+        </w:tc>
+        <w:tc>
+          <w:tcPr>
+            <w:tcW w:type="dxa" w:w="3213"/>
+            <w:vAlign w:val="center"/>
+          </w:tcPr>
+          <w:p>
+            <w:pPr>
+              <w:spacing w:before="79" w:after="79" w:line="276" w:lineRule="auto"/>
+            </w:pPr>
+            <w:r>
+              <w:rPr>
+                <w:rFonts w:ascii="Calibri" w:hAnsi="Calibri"/>
+                <w:sz w:val="20"/>
+              </w:rPr>
+              <w:t>facteurs du SO2, des NOx et du NH3</w:t>
             </w:r>
           </w:p>
         </w:tc>

</xml_diff>